<commit_message>
docs: bring the one-pager up to date, still on one page
It predated the attendance export, offices, and letters and payslips going
out as attachments, so it described the product as it was last week.

Seven lines changed and one added. The additions are folded into lines that
already existed wherever they could be — offices into the list of things a
company defines for itself, the emailed PDF into the line about how a letter
is generated — because the file is called One_Page and a first attempt that
added three bullets came out as two pages, which is a different document.
Only the attendance export earned a line of its own.

Edited in place rather than regenerated: the layout and the two-column flow
are somebody's work, and new bullets are clones of the bullet beside them so
they carry the same runs and spacing. The PDF is exported from the Word file
and confirmed at one page.

Co-Authored-By: Claude Opus 5 <noreply@anthropic.com>
</commit_message>
<xml_diff>
--- a/docs/HRMS_One_Page.docx
+++ b/docs/HRMS_One_Page.docx
@@ -1017,7 +1017,7 @@
                 <w:sz w:val="14"/>
                 <w:szCs w:val="14"/>
               </w:rPr>
-              <w:t xml:space="preserve">Departments, designations and grades defined per company</w:t>
+              <w:t xml:space="preserve">Departments, designations, grades and offices defined per company</w:t>
             </w:r>
           </w:p>
           <w:p>
@@ -1406,6 +1406,40 @@
                 <w:sz w:val="14"/>
                 <w:szCs w:val="14"/>
               </w:rPr>
+              <w:t xml:space="preserve">Excel for any span — working days, leave, hours, overtime</w:t>
+            </w:r>
+          </w:p>
+          <w:p>
+            <w:pPr>
+              <w:spacing w:after="22" w:before="0" w:line="178" w:lineRule="atLeast"/>
+              <w:ind w:left="145" w:hanging="145"/>
+            </w:pPr>
+            <w:r>
+              <w:rPr>
+                <w:rFonts w:ascii="Segoe UI" w:cs="Segoe UI" w:eastAsia="Segoe UI" w:hAnsi="Segoe UI"/>
+                <w:b/>
+                <w:bCs/>
+                <w:i w:val="false"/>
+                <w:iCs w:val="false"/>
+                <w:caps w:val="false"/>
+                <w:color w:val="0284C7"/>
+                <w:sz w:val="13"/>
+                <w:szCs w:val="13"/>
+              </w:rPr>
+              <w:t xml:space="preserve">▪ </w:t>
+            </w:r>
+            <w:r>
+              <w:rPr>
+                <w:rFonts w:ascii="Segoe UI" w:cs="Segoe UI" w:eastAsia="Segoe UI" w:hAnsi="Segoe UI"/>
+                <w:b w:val="false"/>
+                <w:bCs w:val="false"/>
+                <w:i w:val="false"/>
+                <w:iCs w:val="false"/>
+                <w:caps w:val="false"/>
+                <w:color w:val="0F172A"/>
+                <w:sz w:val="14"/>
+                <w:szCs w:val="14"/>
+              </w:rPr>
               <w:t xml:space="preserve">Exceptions corrected by HR, never by the employee</w:t>
             </w:r>
           </w:p>
@@ -1440,7 +1474,7 @@
                 <w:sz w:val="14"/>
                 <w:szCs w:val="14"/>
               </w:rPr>
-              <w:t xml:space="preserve">Company calendar — holidays, events and personal schedule</w:t>
+              <w:t xml:space="preserve">Company calendar — holidays per office, events, personal schedule</w:t>
             </w:r>
           </w:p>
           <w:p>
@@ -2097,7 +2131,7 @@
                 <w:sz w:val="14"/>
                 <w:szCs w:val="14"/>
               </w:rPr>
-              <w:t xml:space="preserve">Payslip reaches the employee's app and inbox together</w:t>
+              <w:t xml:space="preserve">Payslip reaches the app and the inbox together — PDF attached</w:t>
             </w:r>
           </w:p>
           <w:p>
@@ -2603,7 +2637,7 @@
                 <w:sz w:val="14"/>
                 <w:szCs w:val="14"/>
               </w:rPr>
-              <w:t xml:space="preserve">Generated from live data, on company letterhead, with a reference</w:t>
+              <w:t xml:space="preserve">Generated from live data on letterhead, and emailed as a PDF</w:t>
             </w:r>
           </w:p>
           <w:p>
@@ -2637,7 +2671,7 @@
                 <w:sz w:val="14"/>
                 <w:szCs w:val="14"/>
               </w:rPr>
-              <w:t xml:space="preserve">Employees open and share their own letters from the app</w:t>
+              <w:t xml:space="preserve">Employees open and download their letters, on phone or web</w:t>
             </w:r>
           </w:p>
           <w:p>
@@ -3041,7 +3075,7 @@
                 <w:sz w:val="14"/>
                 <w:szCs w:val="14"/>
               </w:rPr>
-              <w:t xml:space="preserve">Email through the company's own SMTP — payslips, letters, resets</w:t>
+              <w:t xml:space="preserve">Email through the company's own SMTP — payslips, letters, leave, announcements</w:t>
             </w:r>
           </w:p>
           <w:p>

</xml_diff>